<commit_message>
Lühenda tehisaru kasutuse kirjeldust ja lisa 3
Co-Authored-By: Claude Opus 5.5 <noreply@anthropic.com>
Claude-Session: https://claude.ai/code/session_013sCxdGunVaMzJft7kZivoT
</commit_message>
<xml_diff>
--- a/Juventus_uuesti_ja_paremini_T2_1.2.docx
+++ b/Juventus_uuesti_ja_paremini_T2_1.2.docx
@@ -1191,10 +1191,15 @@
           <w:b/>
           <w:bCs/>
         </w:rPr>
-        <w:t xml:space="preserve">Tehisaru ja teaduslike lisaallikate kasutamine.</w:t>
-      </w:r>
-      <w:r>
-        <w:t xml:space="preserve"> Rühm kasutas suurt keelemudelit Claude (Anthropic, 2026) töö struktuuri ja analüüsi kavandi koostamiseks, allikate leidmiseks ning valmis versioonile kriitilise tagasiside saamiseks; päringud koostas ja väljundi kvaliteeti kontrollis Robi Mustsaar. Tehisaru pakutud väited ja viited kontrolliti algallikatest; huvi- ja mõjuhinnangud ning alternatiivide hinded on rühma ekspertarvamus. Vestlused tehisaruga toimusid 4. oktoobril 2026; vestlus ja selle põhjal tehtud täiendused on esitatud lisas 3. Spordiklubi brändi ja fännide samastumise mõistmiseks kasutati teaduskirjandust brändiväärtusest (Keller, 1993) ja spordifännide samastumisest klubiga (Wann &amp; Branscombe, 1993).</w:t>
+        <w:t xml:space="preserve">Tehisaru kasutamine.</w:t>
+      </w:r>
+      <w:r>
+        <w:t xml:space="preserve"> Töö koostamisel kasutati 4. oktoobril 2026 keelemudelit Claude (Anthropic, 2026): allikate otsimiseks, töö struktuuri ja tekstikavandi, jooniste ja tabelite koostamiseks ning tagasiside saamiseks. Rühm andis projekti lähteandmed (meeskond, huvipooled, eelarve, ajakava), päringud koostas ja väljundi vaatas üle Robi Mustsaar. Huvi- ja mõjuhinnangud ning alternatiivide hinded on esialgsed ja rühm valideerib need. Rühm vastutab töö sisu eest; vestluse kokkuvõte on lisas 3.</w:t>
+      </w:r>
+    </w:p>
+    <w:p>
+      <w:r>
+        <w:t xml:space="preserve">Spordiklubi brändi ja fännide samastumise mõistmiseks kasutati teaduskirjandust brändiväärtusest (Keller, 1993) ja spordifännide samastumisest klubiga (Wann &amp; Branscombe, 1993).</w:t>
       </w:r>
     </w:p>
     <w:p>
@@ -18260,7 +18265,7 @@
         <w:t xml:space="preserve">Millist tagasisidet saime tehisarult ja kas täiendasime tööd?</w:t>
       </w:r>
       <w:r>
-        <w:t xml:space="preserve"> Tehisaru tagasiside ja selle põhjal tehtud muudatused on esitatud lisas 3.</w:t>
+        <w:t xml:space="preserve"> Tehisaru tagasiside ja avatud küsimused on kokku võetud lisas 3.</w:t>
       </w:r>
     </w:p>
     <w:p>
@@ -18281,12 +18286,12 @@
         <w:pageBreakBefore/>
       </w:pPr>
       <w:r>
-        <w:t xml:space="preserve">Lisa 3. Vestlus tehisaruga ja selle põhjal tehtud täiendused</w:t>
+        <w:t xml:space="preserve">Lisa 3. Vestlus tehisaruga</w:t>
       </w:r>
     </w:p>
     <w:p>
       <w:r>
-        <w:t xml:space="preserve">Tehisaruna kasutati keelemudelit Claude (Anthropic, 2026); päringud koostas Robi Mustsaar. Allpool on vestluse sisu lühendatult; täielik vestlus on rühma Google Workspace’i kaustas kõigile liikmetele nähtav.</w:t>
+        <w:t xml:space="preserve">Tehisaruna kasutati keelemudelit Claude (Anthropic, 2026), päringud koostas Robi Mustsaar. Täielik vestlus on rühma Google Workspace’i kaustas kõigile liikmetele nähtav.</w:t>
       </w:r>
     </w:p>
     <w:p>
@@ -18295,10 +18300,10 @@
           <w:b/>
           <w:bCs/>
         </w:rPr>
-        <w:t xml:space="preserve">Päring 1 (lühendatult):</w:t>
-      </w:r>
-      <w:r>
-        <w:t xml:space="preserve"> „Vaadake üle slaidikogu 2 slaidid 1–36 ning muud seonduvad juhendid. Esitage terviklikku peatükkide struktuuri sisaldav DOCX-fail, milles on alapeatükk 1.2: metoodika, probleemide puu, eesmärkide puu, huvigruppide tabel ja kaasamise strateegia, alternatiivide võrdlus; lisad tööjaotuse ja õppetundidega.“</w:t>
+        <w:t xml:space="preserve">Päringud (lühendatult):</w:t>
+      </w:r>
+      <w:r>
+        <w:t xml:space="preserve"> 1) koostada slaidikogu 2 ja seonduvate juhendite põhjal alapeatükk 1.2 koos tervikliku struktuuri ja lisadega; 2) kohandada töö projektile „Juventus uuesti ja paremini“ rühma antud lähteandmetega (meeskond, huvipooled, spetsialistid, eelarve 96 800 €, teostusfaas 3 kuud); 3) vormistada töö Pärnu kolledži üliõpilastööde juhendi järgi.</w:t>
       </w:r>
     </w:p>
     <w:p>
@@ -18307,19 +18312,7 @@
           <w:b/>
           <w:bCs/>
         </w:rPr>
-        <w:t xml:space="preserve">Päring 2 (lühendatult):</w:t>
-      </w:r>
-      <w:r>
-        <w:t xml:space="preserve"> „Meie projekt on Juventus FC rebrändimine „Juventus uuesti ja paremini“. 2017. aasta rebränding põhjustas fännibaasi killustumise. Meeskond: Herman Ra Truvek (projektijuht), Robi Mustsaar (AI prompter/kvaliteedikontroll), Hugo-Christopher Saar (ekspert), Ragnar Dietrich (omanik). Huvipooled, kaheksa spetsialistirolli, eelarve ca 96 800 € (7 kulukategooriat, ca 9000 € reserv), teostusfaas 3 kuud.“</w:t>
-      </w:r>
-    </w:p>
-    <w:p>
-      <w:r>
-        <w:rPr>
-          <w:b/>
-          <w:bCs/>
-        </w:rPr>
-        <w:t xml:space="preserve">Tehisaru tagasiside ja rühma tegevus:</w:t>
+        <w:t xml:space="preserve">Peamine tagasiside ja avatud küsimused:</w:t>
       </w:r>
     </w:p>
     <w:p>
@@ -18332,14 +18325,7 @@
         <w:spacing w:before="0"/>
       </w:pPr>
       <w:r>
-        <w:t xml:space="preserve">Probleemipuusse ei tohi panna projekti riske (nt „fännid võivad ka uut lahendust kritiseerida“) – need kuuluvad alapeatükki 1.3. </w:t>
-      </w:r>
-      <w:r>
-        <w:rPr>
-          <w:i/>
-          <w:iCs/>
-        </w:rPr>
-        <w:t xml:space="preserve">Arvestatud.</w:t>
+        <w:t xml:space="preserve">„Uus logo“ on projekti tulem, mitte eesmärk – eesmärk on fännide samastumine klubiga.</w:t>
       </w:r>
     </w:p>
     <w:p>
@@ -18352,14 +18338,7 @@
         <w:spacing w:before="0"/>
       </w:pPr>
       <w:r>
-        <w:t xml:space="preserve">„Uus logo“ on projekti tulem, mitte eesmärk; eesmärk on fännide samastumine klubiga. </w:t>
-      </w:r>
-      <w:r>
-        <w:rPr>
-          <w:i/>
-          <w:iCs/>
-        </w:rPr>
-        <w:t xml:space="preserve">Arvestatud: eesmärgipuus on seisundid ja mõõdetavad näitajad.</w:t>
+        <w:t xml:space="preserve">96 800 € ja 3 kuud ei piisa täielikuks globaalseks rebrändinguks, seetõttu eelistati olemasolevat „J“-kaubamärki kasutavaid alternatiive.</w:t>
       </w:r>
     </w:p>
     <w:p>
@@ -18372,14 +18351,7 @@
         <w:spacing w:before="0"/>
       </w:pPr>
       <w:r>
-        <w:t xml:space="preserve">96 800 eurot ja 3 kuud on täieliku globaalse rebrändingu jaoks vähe (2017. aasta identiteedi lõi rahvusvaheline agentuur Interbrand). Seetõttu on eelistatud alternatiivid, mis kasutavad olemasolevat „J“-kaubamärki. </w:t>
-      </w:r>
-      <w:r>
-        <w:rPr>
-          <w:i/>
-          <w:iCs/>
-        </w:rPr>
-        <w:t xml:space="preserve">Arvestatud: kriteeriumid K3 ja K4.</w:t>
+        <w:t xml:space="preserve">Eelarve jaotus kategooriate kaupa (tabel 7) on näidisjaotus – kinnitavad Ragnar Dietrich ja Herman Ra Truvek.</w:t>
       </w:r>
     </w:p>
     <w:p>
@@ -18392,86 +18364,12 @@
         <w:spacing w:before="0"/>
       </w:pPr>
       <w:r>
-        <w:t xml:space="preserve">Eelarve jaotus kategooriate kaupa (tabel 7) on tehisaru pakutud näidisjaotus, mis vastab antud kogusummale ja reservile. </w:t>
-      </w:r>
-      <w:r>
-        <w:rPr>
-          <w:i/>
-          <w:iCs/>
-        </w:rPr>
-        <w:t xml:space="preserve">Avatud: kinnitavad Ragnar Dietrich ja Herman Ra Truvek.</w:t>
+        <w:t xml:space="preserve">Torino härja kasutusõigus pärandvapis tuleb kontrollida – Hugo-Christopher Saar.</w:t>
       </w:r>
     </w:p>
     <w:p>
-      <w:pPr>
-        <w:pStyle w:val="ListParagraph"/>
-        <w:numPr>
-          <w:ilvl w:val="0"/>
-          <w:numId w:val="4"/>
-        </w:numPr>
-        <w:spacing w:before="0"/>
-      </w:pPr>
-      <w:r>
-        <w:t xml:space="preserve">Rühma viidatud lisamaterjali link 2017. aasta rebrändingu kohta ei jõudnud tehisaruni; kasutati Dezeeni, Football Italia, Design Weeki ja It’s Nice That’i artikleid. </w:t>
-      </w:r>
-      <w:r>
-        <w:rPr>
-          <w:i/>
-          <w:iCs/>
-        </w:rPr>
-        <w:t xml:space="preserve">Avatud: Robi Mustsaar lisab rühma allika viidetesse.</w:t>
-      </w:r>
-    </w:p>
-    <w:p>
-      <w:pPr>
-        <w:pStyle w:val="ListParagraph"/>
-        <w:numPr>
-          <w:ilvl w:val="0"/>
-          <w:numId w:val="4"/>
-        </w:numPr>
-        <w:spacing w:before="0"/>
-      </w:pPr>
-      <w:r>
-        <w:t xml:space="preserve">Torino härg on linna sümbol, mistõttu tuleb selle kasutusõigus pärandvapis kontrollida. </w:t>
-      </w:r>
-      <w:r>
-        <w:rPr>
-          <w:i/>
-          <w:iCs/>
-        </w:rPr>
-        <w:t xml:space="preserve">Avatud: Hugo-Christopher Saar koos kaubamärgiõiguse spetsialistiga.</w:t>
-      </w:r>
-    </w:p>
-    <w:p>
-      <w:pPr>
-        <w:pStyle w:val="ListParagraph"/>
-        <w:numPr>
-          <w:ilvl w:val="0"/>
-          <w:numId w:val="4"/>
-        </w:numPr>
-        <w:spacing w:before="0"/>
-      </w:pPr>
-      <w:r>
-        <w:t xml:space="preserve">Tehisaru ei pääsenud ligi LinkedIni artiklile ega kolledži blanketile. </w:t>
-      </w:r>
-      <w:r>
-        <w:rPr>
-          <w:i/>
-          <w:iCs/>
-        </w:rPr>
-        <w:t xml:space="preserve">Avatud: Herman Ra Truvek loeb artikli läbi, Robi Mustsaar tõstab töö blanketti.</w:t>
-      </w:r>
-    </w:p>
-    <w:p>
-      <w:r>
-        <w:rPr>
-          <w:b/>
-          <w:bCs/>
-        </w:rPr>
-        <w:t xml:space="preserve">Rühma hinnang tehisaru kasutamisele:</w:t>
-      </w:r>
-      <w:r>
-        <w:t xml:space="preserve"> tehisaru kiirendas struktuuri loomist ja aitas leida nõrku kohti, kuid sisulised hinnangud, projekti kontekst ja allikate kontroll jäid rühma vastutusele.</w:t>
+      <w:r>
+        <w:t xml:space="preserve">Rühma hinnangul kiirendas tehisaru töö ülesehitust ja allikate leidmist; sisu õigsuse ja lõpliku teksti eest vastutab rühm.</w:t>
       </w:r>
     </w:p>
     <w:sectPr>

</xml_diff>